<commit_message>
Slight template updates to the Horizontal Lesson Plan.
</commit_message>
<xml_diff>
--- a/templates/docx_templates/horizontal_lesson_plan_master.docx
+++ b/templates/docx_templates/horizontal_lesson_plan_master.docx
@@ -2,10 +2,285 @@
 <file path=word/document.xml><?xml version="1.0" encoding="utf-8"?>
 <w:document xmlns:wpc="http://schemas.microsoft.com/office/word/2010/wordprocessingCanvas" xmlns:cx="http://schemas.microsoft.com/office/drawing/2014/chartex" xmlns:cx1="http://schemas.microsoft.com/office/drawing/2015/9/8/chartex" xmlns:cx2="http://schemas.microsoft.com/office/drawing/2015/10/21/chartex" xmlns:cx3="http://schemas.microsoft.com/office/drawing/2016/5/9/chartex" xmlns:cx4="http://schemas.microsoft.com/office/drawing/2016/5/10/chartex" xmlns:cx5="http://schemas.microsoft.com/office/drawing/2016/5/11/chartex" xmlns:cx6="http://schemas.microsoft.com/office/drawing/2016/5/12/chartex" xmlns:cx7="http://schemas.microsoft.com/office/drawing/2016/5/13/chartex" xmlns:cx8="http://schemas.microsoft.com/office/drawing/2016/5/14/chartex" xmlns:mc="http://schemas.openxmlformats.org/markup-compatibility/2006" xmlns:aink="http://schemas.microsoft.com/office/drawing/2016/ink" xmlns:am3d="http://schemas.microsoft.com/office/drawing/2017/model3d" xmlns:o="urn:schemas-microsoft-com:office:office" xmlns:oel="http://schemas.microsoft.com/office/2019/extlst" xmlns:r="http://schemas.openxmlformats.org/officeDocument/2006/relationships" xmlns:m="http://schemas.openxmlformats.org/officeDocument/2006/math" xmlns:v="urn:schemas-microsoft-com:vml" xmlns:wp14="http://schemas.microsoft.com/office/word/2010/wordprocessingDrawing" xmlns:wp="http://schemas.openxmlformats.org/drawingml/2006/wordprocessingDrawing" xmlns:w10="urn:schemas-microsoft-com:office:word" xmlns:w="http://schemas.openxmlformats.org/wordprocessingml/2006/main" xmlns:w14="http://schemas.microsoft.com/office/word/2010/wordml" xmlns:w15="http://schemas.microsoft.com/office/word/2012/wordml" xmlns:w16cex="http://schemas.microsoft.com/office/word/2018/wordml/cex" xmlns:w16cid="http://schemas.microsoft.com/office/word/2016/wordml/cid" xmlns:w16="http://schemas.microsoft.com/office/word/2018/wordml" xmlns:w16du="http://schemas.microsoft.com/office/word/2023/wordml/word16du" xmlns:w16sdtdh="http://schemas.microsoft.com/office/word/2020/wordml/sdtdatahash" xmlns:w16sdtfl="http://schemas.microsoft.com/office/word/2024/wordml/sdtformatlock" xmlns:w16se="http://schemas.microsoft.com/office/word/2015/wordml/symex" xmlns:wpg="http://schemas.microsoft.com/office/word/2010/wordprocessingGroup" xmlns:wpi="http://schemas.microsoft.com/office/word/2010/wordprocessingInk" xmlns:wne="http://schemas.microsoft.com/office/word/2006/wordml" xmlns:wps="http://schemas.microsoft.com/office/word/2010/wordprocessingShape" mc:Ignorable="w14 w15 w16se w16cid w16 w16cex w16sdtdh w16sdtfl w16du wp14">
   <w:body>
+    <w:tbl>
+      <w:tblPr>
+        <w:tblStyle w:val="TableGrid"/>
+        <w:tblpPr w:leftFromText="180" w:rightFromText="180" w:vertAnchor="text" w:horzAnchor="margin" w:tblpXSpec="right" w:tblpY="619"/>
+        <w:tblW w:w="0" w:type="auto"/>
+        <w:tblBorders>
+          <w:top w:val="none" w:sz="0" w:space="0" w:color="auto"/>
+          <w:left w:val="none" w:sz="0" w:space="0" w:color="auto"/>
+          <w:bottom w:val="none" w:sz="0" w:space="0" w:color="auto"/>
+          <w:right w:val="none" w:sz="0" w:space="0" w:color="auto"/>
+          <w:insideH w:val="none" w:sz="0" w:space="0" w:color="auto"/>
+          <w:insideV w:val="none" w:sz="0" w:space="0" w:color="auto"/>
+        </w:tblBorders>
+        <w:tblLook w:val="04A0" w:firstRow="1" w:lastRow="0" w:firstColumn="1" w:lastColumn="0" w:noHBand="0" w:noVBand="1"/>
+      </w:tblPr>
+      <w:tblGrid>
+        <w:gridCol w:w="3865"/>
+        <w:gridCol w:w="4950"/>
+        <w:gridCol w:w="4230"/>
+        <w:gridCol w:w="3834"/>
+      </w:tblGrid>
+      <w:tr>
+        <w:tc>
+          <w:tcPr>
+            <w:tcW w:w="3865" w:type="dxa"/>
+          </w:tcPr>
+          <w:p>
+            <w:pPr>
+              <w:rPr>
+                <w:rFonts w:ascii="Segoe UI" w:eastAsia="Calibri" w:hAnsi="Segoe UI" w:cs="Segoe UI"/>
+                <w:b/>
+                <w:bCs/>
+                <w:sz w:val="24"/>
+                <w:szCs w:val="24"/>
+              </w:rPr>
+            </w:pPr>
+            <w:r>
+              <w:rPr>
+                <w:rFonts w:ascii="Segoe UI" w:eastAsia="Calibri" w:hAnsi="Segoe UI" w:cs="Segoe UI"/>
+                <w:b/>
+                <w:bCs/>
+                <w:sz w:val="24"/>
+                <w:szCs w:val="24"/>
+              </w:rPr>
+              <w:t xml:space="preserve">SCHOOL: </w:t>
+            </w:r>
+            <w:r>
+              <w:rPr>
+                <w:rFonts w:ascii="Segoe UI" w:eastAsia="Calibri" w:hAnsi="Segoe UI" w:cs="Segoe UI"/>
+                <w:b/>
+                <w:bCs/>
+                <w:sz w:val="24"/>
+                <w:szCs w:val="24"/>
+                <w:u w:val="single"/>
+              </w:rPr>
+              <w:t>{{ school.name }}</w:t>
+            </w:r>
+            <w:r>
+              <w:rPr>
+                <w:rFonts w:ascii="Segoe UI" w:eastAsia="Calibri" w:hAnsi="Segoe UI" w:cs="Segoe UI"/>
+                <w:b/>
+                <w:bCs/>
+                <w:sz w:val="24"/>
+                <w:szCs w:val="24"/>
+                <w:u w:val="single"/>
+              </w:rPr>
+              <w:t>___</w:t>
+            </w:r>
+          </w:p>
+        </w:tc>
+        <w:tc>
+          <w:tcPr>
+            <w:tcW w:w="4950" w:type="dxa"/>
+          </w:tcPr>
+          <w:p>
+            <w:pPr>
+              <w:jc w:val="right"/>
+              <w:rPr>
+                <w:rFonts w:ascii="Segoe UI" w:eastAsia="Calibri" w:hAnsi="Segoe UI" w:cs="Segoe UI"/>
+                <w:b/>
+                <w:bCs/>
+                <w:sz w:val="24"/>
+                <w:szCs w:val="24"/>
+              </w:rPr>
+            </w:pPr>
+            <w:r>
+              <w:rPr>
+                <w:rFonts w:ascii="Segoe UI" w:eastAsia="Calibri" w:hAnsi="Segoe UI" w:cs="Segoe UI"/>
+                <w:b/>
+                <w:bCs/>
+                <w:sz w:val="24"/>
+                <w:szCs w:val="24"/>
+              </w:rPr>
+              <w:t xml:space="preserve">SUBJECT: </w:t>
+            </w:r>
+            <w:sdt>
+              <w:sdtPr>
+                <w:rPr>
+                  <w:rFonts w:ascii="Segoe UI" w:eastAsia="Calibri" w:hAnsi="Segoe UI" w:cs="Segoe UI"/>
+                  <w:b/>
+                  <w:bCs/>
+                  <w:sz w:val="24"/>
+                  <w:szCs w:val="24"/>
+                </w:rPr>
+                <w:id w:val="532004991"/>
+                <w14:checkbox>
+                  <w14:checked w14:val="0"/>
+                  <w14:checkedState w14:val="2612" w14:font="MS Gothic"/>
+                  <w14:uncheckedState w14:val="2610" w14:font="MS Gothic"/>
+                </w14:checkbox>
+              </w:sdtPr>
+              <w:sdtContent>
+                <w:r>
+                  <w:rPr>
+                    <w:rFonts w:ascii="Segoe UI Symbol" w:eastAsia="MS Gothic" w:hAnsi="Segoe UI Symbol" w:cs="Segoe UI Symbol"/>
+                    <w:b/>
+                    <w:bCs/>
+                    <w:sz w:val="24"/>
+                    <w:szCs w:val="24"/>
+                  </w:rPr>
+                  <w:t>☐</w:t>
+                </w:r>
+              </w:sdtContent>
+            </w:sdt>
+            <w:r>
+              <w:rPr>
+                <w:rFonts w:ascii="Segoe UI" w:eastAsia="Calibri" w:hAnsi="Segoe UI" w:cs="Segoe UI"/>
+                <w:b/>
+                <w:bCs/>
+                <w:sz w:val="24"/>
+                <w:szCs w:val="24"/>
+              </w:rPr>
+              <w:t xml:space="preserve"> MATHEMATICS </w:t>
+            </w:r>
+            <w:sdt>
+              <w:sdtPr>
+                <w:rPr>
+                  <w:rFonts w:ascii="Segoe UI" w:eastAsia="Calibri" w:hAnsi="Segoe UI" w:cs="Segoe UI"/>
+                  <w:b/>
+                  <w:bCs/>
+                  <w:sz w:val="24"/>
+                  <w:szCs w:val="24"/>
+                </w:rPr>
+                <w:id w:val="1503314149"/>
+                <w14:checkbox>
+                  <w14:checked w14:val="0"/>
+                  <w14:checkedState w14:val="2612" w14:font="MS Gothic"/>
+                  <w14:uncheckedState w14:val="2610" w14:font="MS Gothic"/>
+                </w14:checkbox>
+              </w:sdtPr>
+              <w:sdtContent>
+                <w:r>
+                  <w:rPr>
+                    <w:rFonts w:ascii="Segoe UI Symbol" w:eastAsia="MS Gothic" w:hAnsi="Segoe UI Symbol" w:cs="Segoe UI Symbol"/>
+                    <w:b/>
+                    <w:bCs/>
+                    <w:sz w:val="24"/>
+                    <w:szCs w:val="24"/>
+                  </w:rPr>
+                  <w:t>☐</w:t>
+                </w:r>
+              </w:sdtContent>
+            </w:sdt>
+            <w:r>
+              <w:rPr>
+                <w:rFonts w:ascii="Segoe UI" w:eastAsia="Calibri" w:hAnsi="Segoe UI" w:cs="Segoe UI"/>
+                <w:b/>
+                <w:bCs/>
+                <w:sz w:val="24"/>
+                <w:szCs w:val="24"/>
+              </w:rPr>
+              <w:t xml:space="preserve"> SCIENCE</w:t>
+            </w:r>
+          </w:p>
+        </w:tc>
+        <w:tc>
+          <w:tcPr>
+            <w:tcW w:w="4230" w:type="dxa"/>
+          </w:tcPr>
+          <w:p>
+            <w:pPr>
+              <w:jc w:val="right"/>
+              <w:rPr>
+                <w:rFonts w:ascii="Segoe UI" w:eastAsia="Calibri" w:hAnsi="Segoe UI" w:cs="Segoe UI"/>
+                <w:b/>
+                <w:bCs/>
+                <w:sz w:val="24"/>
+                <w:szCs w:val="24"/>
+              </w:rPr>
+            </w:pPr>
+            <w:r>
+              <w:rPr>
+                <w:rFonts w:ascii="Segoe UI" w:eastAsia="Calibri" w:hAnsi="Segoe UI" w:cs="Segoe UI"/>
+                <w:b/>
+                <w:bCs/>
+                <w:sz w:val="24"/>
+                <w:szCs w:val="24"/>
+              </w:rPr>
+              <w:t xml:space="preserve">TEACHER: </w:t>
+            </w:r>
+            <w:r>
+              <w:rPr>
+                <w:rFonts w:ascii="Segoe UI" w:eastAsia="Calibri" w:hAnsi="Segoe UI" w:cs="Segoe UI"/>
+                <w:b/>
+                <w:bCs/>
+                <w:sz w:val="24"/>
+                <w:szCs w:val="24"/>
+                <w:u w:val="single"/>
+              </w:rPr>
+              <w:t>{{ teacher.name }}</w:t>
+            </w:r>
+            <w:r>
+              <w:rPr>
+                <w:rFonts w:ascii="Segoe UI" w:eastAsia="Calibri" w:hAnsi="Segoe UI" w:cs="Segoe UI"/>
+                <w:b/>
+                <w:bCs/>
+                <w:sz w:val="24"/>
+                <w:szCs w:val="24"/>
+                <w:u w:val="single"/>
+              </w:rPr>
+              <w:t>___</w:t>
+            </w:r>
+          </w:p>
+        </w:tc>
+        <w:tc>
+          <w:tcPr>
+            <w:tcW w:w="3834" w:type="dxa"/>
+          </w:tcPr>
+          <w:p>
+            <w:pPr>
+              <w:jc w:val="right"/>
+              <w:rPr>
+                <w:rFonts w:ascii="Calibri" w:eastAsia="Calibri" w:hAnsi="Calibri" w:cs="Calibri"/>
+              </w:rPr>
+            </w:pPr>
+            <w:r>
+              <w:rPr>
+                <w:rFonts w:ascii="Segoe UI" w:eastAsia="Calibri" w:hAnsi="Segoe UI" w:cs="Segoe UI"/>
+                <w:b/>
+                <w:bCs/>
+                <w:sz w:val="24"/>
+                <w:szCs w:val="24"/>
+              </w:rPr>
+              <w:t xml:space="preserve">SCHOOL YEAR: </w:t>
+            </w:r>
+            <w:r>
+              <w:rPr>
+                <w:rFonts w:ascii="Segoe UI" w:eastAsia="Calibri" w:hAnsi="Segoe UI" w:cs="Segoe UI"/>
+                <w:b/>
+                <w:bCs/>
+                <w:sz w:val="24"/>
+                <w:szCs w:val="24"/>
+                <w:u w:val="single"/>
+              </w:rPr>
+              <w:t>{{ term }}</w:t>
+            </w:r>
+            <w:r>
+              <w:rPr>
+                <w:rFonts w:ascii="Segoe UI" w:eastAsia="Calibri" w:hAnsi="Segoe UI" w:cs="Segoe UI"/>
+                <w:b/>
+                <w:bCs/>
+                <w:sz w:val="24"/>
+                <w:szCs w:val="24"/>
+                <w:u w:val="single"/>
+              </w:rPr>
+              <w:t>___</w:t>
+            </w:r>
+          </w:p>
+        </w:tc>
+      </w:tr>
+    </w:tbl>
     <w:p>
       <w:pPr>
         <w:rPr>
-          <w:rFonts w:ascii="Calibri" w:eastAsia="Calibri" w:hAnsi="Calibri" w:cs="Calibri"/>
+          <w:rFonts w:ascii="Segoe UI" w:eastAsia="Calibri" w:hAnsi="Segoe UI" w:cs="Segoe UI"/>
+          <w:b/>
+          <w:bCs/>
+          <w:sz w:val="24"/>
+          <w:szCs w:val="24"/>
         </w:rPr>
       </w:pPr>
       <w:r>
@@ -54,260 +329,6 @@
           </wp:inline>
         </w:drawing>
       </w:r>
-      <w:r>
-        <w:rPr>
-          <w:rFonts w:ascii="Segoe UI" w:eastAsia="Calibri" w:hAnsi="Segoe UI" w:cs="Segoe UI"/>
-          <w:b/>
-          <w:bCs/>
-          <w:sz w:val="24"/>
-          <w:szCs w:val="24"/>
-        </w:rPr>
-        <w:t xml:space="preserve">   </w:t>
-      </w:r>
-      <w:r>
-        <w:rPr>
-          <w:rFonts w:ascii="Segoe UI" w:eastAsia="Calibri" w:hAnsi="Segoe UI" w:cs="Segoe UI"/>
-          <w:b/>
-          <w:bCs/>
-          <w:sz w:val="24"/>
-          <w:szCs w:val="24"/>
-        </w:rPr>
-        <w:t xml:space="preserve">SCHOOL: </w:t>
-      </w:r>
-      <w:r>
-        <w:rPr>
-          <w:rFonts w:ascii="Segoe UI" w:eastAsia="Calibri" w:hAnsi="Segoe UI" w:cs="Segoe UI"/>
-          <w:b/>
-          <w:bCs/>
-          <w:sz w:val="24"/>
-          <w:szCs w:val="24"/>
-          <w:u w:val="single"/>
-        </w:rPr>
-        <w:t>{{ school.name }}</w:t>
-      </w:r>
-      <w:r>
-        <w:rPr>
-          <w:rFonts w:ascii="Segoe UI" w:eastAsia="Calibri" w:hAnsi="Segoe UI" w:cs="Segoe UI"/>
-          <w:b/>
-          <w:bCs/>
-          <w:sz w:val="24"/>
-          <w:szCs w:val="24"/>
-          <w:u w:val="single"/>
-        </w:rPr>
-        <w:t>____</w:t>
-      </w:r>
-      <w:r>
-        <w:rPr>
-          <w:rFonts w:ascii="Segoe UI" w:eastAsia="Calibri" w:hAnsi="Segoe UI" w:cs="Segoe UI"/>
-          <w:b/>
-          <w:bCs/>
-          <w:sz w:val="24"/>
-          <w:szCs w:val="24"/>
-        </w:rPr>
-        <w:tab/>
-      </w:r>
-      <w:r>
-        <w:rPr>
-          <w:rFonts w:ascii="Segoe UI" w:eastAsia="Calibri" w:hAnsi="Segoe UI" w:cs="Segoe UI"/>
-          <w:b/>
-          <w:bCs/>
-          <w:sz w:val="24"/>
-          <w:szCs w:val="24"/>
-        </w:rPr>
-        <w:t>SUBJECT</w:t>
-      </w:r>
-      <w:r>
-        <w:rPr>
-          <w:rFonts w:ascii="Segoe UI" w:eastAsia="Calibri" w:hAnsi="Segoe UI" w:cs="Segoe UI"/>
-          <w:b/>
-          <w:bCs/>
-          <w:sz w:val="24"/>
-          <w:szCs w:val="24"/>
-        </w:rPr>
-        <w:t>:</w:t>
-      </w:r>
-      <w:r>
-        <w:rPr>
-          <w:rFonts w:ascii="Segoe UI" w:eastAsia="Calibri" w:hAnsi="Segoe UI" w:cs="Segoe UI"/>
-          <w:b/>
-          <w:bCs/>
-          <w:sz w:val="24"/>
-          <w:szCs w:val="24"/>
-        </w:rPr>
-        <w:t xml:space="preserve"> </w:t>
-      </w:r>
-      <w:sdt>
-        <w:sdtPr>
-          <w:rPr>
-            <w:rFonts w:ascii="Segoe UI" w:eastAsia="Calibri" w:hAnsi="Segoe UI" w:cs="Segoe UI"/>
-            <w:b/>
-            <w:bCs/>
-            <w:sz w:val="24"/>
-            <w:szCs w:val="24"/>
-          </w:rPr>
-          <w:id w:val="532004991"/>
-          <w14:checkbox>
-            <w14:checked w14:val="0"/>
-            <w14:checkedState w14:val="2612" w14:font="MS Gothic"/>
-            <w14:uncheckedState w14:val="2610" w14:font="MS Gothic"/>
-          </w14:checkbox>
-        </w:sdtPr>
-        <w:sdtContent>
-          <w:r>
-            <w:rPr>
-              <w:rFonts w:ascii="Segoe UI Symbol" w:eastAsia="MS Gothic" w:hAnsi="Segoe UI Symbol" w:cs="Segoe UI Symbol"/>
-              <w:b/>
-              <w:bCs/>
-              <w:sz w:val="24"/>
-              <w:szCs w:val="24"/>
-            </w:rPr>
-            <w:t>☐</w:t>
-          </w:r>
-        </w:sdtContent>
-      </w:sdt>
-      <w:r>
-        <w:rPr>
-          <w:rFonts w:ascii="Segoe UI" w:eastAsia="Calibri" w:hAnsi="Segoe UI" w:cs="Segoe UI"/>
-          <w:b/>
-          <w:bCs/>
-          <w:sz w:val="24"/>
-          <w:szCs w:val="24"/>
-        </w:rPr>
-        <w:t xml:space="preserve"> MATHEMATICS </w:t>
-      </w:r>
-      <w:sdt>
-        <w:sdtPr>
-          <w:rPr>
-            <w:rFonts w:ascii="Segoe UI" w:eastAsia="Calibri" w:hAnsi="Segoe UI" w:cs="Segoe UI"/>
-            <w:b/>
-            <w:bCs/>
-            <w:sz w:val="24"/>
-            <w:szCs w:val="24"/>
-          </w:rPr>
-          <w:id w:val="1503314149"/>
-          <w14:checkbox>
-            <w14:checked w14:val="0"/>
-            <w14:checkedState w14:val="2612" w14:font="MS Gothic"/>
-            <w14:uncheckedState w14:val="2610" w14:font="MS Gothic"/>
-          </w14:checkbox>
-        </w:sdtPr>
-        <w:sdtContent>
-          <w:r>
-            <w:rPr>
-              <w:rFonts w:ascii="Segoe UI Symbol" w:eastAsia="MS Gothic" w:hAnsi="Segoe UI Symbol" w:cs="Segoe UI Symbol"/>
-              <w:b/>
-              <w:bCs/>
-              <w:sz w:val="24"/>
-              <w:szCs w:val="24"/>
-            </w:rPr>
-            <w:t>☐</w:t>
-          </w:r>
-        </w:sdtContent>
-      </w:sdt>
-      <w:r>
-        <w:rPr>
-          <w:rFonts w:ascii="Segoe UI" w:eastAsia="Calibri" w:hAnsi="Segoe UI" w:cs="Segoe UI"/>
-          <w:b/>
-          <w:bCs/>
-          <w:sz w:val="24"/>
-          <w:szCs w:val="24"/>
-        </w:rPr>
-        <w:t xml:space="preserve"> SCIENCE</w:t>
-      </w:r>
-      <w:r>
-        <w:rPr>
-          <w:rFonts w:ascii="Segoe UI" w:eastAsia="Calibri" w:hAnsi="Segoe UI" w:cs="Segoe UI"/>
-          <w:b/>
-          <w:bCs/>
-          <w:sz w:val="24"/>
-          <w:szCs w:val="24"/>
-        </w:rPr>
-        <w:tab/>
-      </w:r>
-      <w:r>
-        <w:rPr>
-          <w:rFonts w:ascii="Segoe UI" w:eastAsia="Calibri" w:hAnsi="Segoe UI" w:cs="Segoe UI"/>
-          <w:b/>
-          <w:bCs/>
-          <w:sz w:val="24"/>
-          <w:szCs w:val="24"/>
-        </w:rPr>
-        <w:t xml:space="preserve">TEACHER: </w:t>
-      </w:r>
-      <w:r>
-        <w:rPr>
-          <w:rFonts w:ascii="Segoe UI" w:eastAsia="Calibri" w:hAnsi="Segoe UI" w:cs="Segoe UI"/>
-          <w:b/>
-          <w:bCs/>
-          <w:sz w:val="24"/>
-          <w:szCs w:val="24"/>
-          <w:u w:val="single"/>
-        </w:rPr>
-        <w:t>{{ teacher.name }}</w:t>
-      </w:r>
-      <w:r>
-        <w:rPr>
-          <w:rFonts w:ascii="Segoe UI" w:eastAsia="Calibri" w:hAnsi="Segoe UI" w:cs="Segoe UI"/>
-          <w:b/>
-          <w:bCs/>
-          <w:sz w:val="24"/>
-          <w:szCs w:val="24"/>
-          <w:u w:val="single"/>
-        </w:rPr>
-        <w:t>_____</w:t>
-      </w:r>
-      <w:r>
-        <w:rPr>
-          <w:rFonts w:ascii="Segoe UI" w:eastAsia="Calibri" w:hAnsi="Segoe UI" w:cs="Segoe UI"/>
-          <w:b/>
-          <w:bCs/>
-          <w:sz w:val="24"/>
-          <w:szCs w:val="24"/>
-        </w:rPr>
-        <w:tab/>
-      </w:r>
-      <w:r>
-        <w:rPr>
-          <w:rFonts w:ascii="Segoe UI" w:eastAsia="Calibri" w:hAnsi="Segoe UI" w:cs="Segoe UI"/>
-          <w:b/>
-          <w:bCs/>
-          <w:sz w:val="24"/>
-          <w:szCs w:val="24"/>
-        </w:rPr>
-        <w:t>SCHOOL YEAR</w:t>
-      </w:r>
-      <w:r>
-        <w:rPr>
-          <w:rFonts w:ascii="Segoe UI" w:eastAsia="Calibri" w:hAnsi="Segoe UI" w:cs="Segoe UI"/>
-          <w:b/>
-          <w:bCs/>
-          <w:sz w:val="24"/>
-          <w:szCs w:val="24"/>
-        </w:rPr>
-        <w:t xml:space="preserve">: </w:t>
-      </w:r>
-      <w:r>
-        <w:rPr>
-          <w:rFonts w:ascii="Segoe UI" w:eastAsia="Calibri" w:hAnsi="Segoe UI" w:cs="Segoe UI"/>
-          <w:b/>
-          <w:bCs/>
-          <w:sz w:val="24"/>
-          <w:szCs w:val="24"/>
-          <w:u w:val="single"/>
-        </w:rPr>
-        <w:t>{{ term }}</w:t>
-      </w:r>
-      <w:r>
-        <w:rPr>
-          <w:rFonts w:ascii="Segoe UI" w:eastAsia="Calibri" w:hAnsi="Segoe UI" w:cs="Segoe UI"/>
-          <w:b/>
-          <w:bCs/>
-          <w:sz w:val="24"/>
-          <w:szCs w:val="24"/>
-          <w:u w:val="single"/>
-        </w:rPr>
-        <w:t>_____</w:t>
-      </w:r>
     </w:p>
     <w:tbl>
       <w:tblPr>
@@ -338,6 +359,7 @@
       <w:tr>
         <w:trPr>
           <w:trHeight w:val="296"/>
+          <w:tblHeader/>
         </w:trPr>
         <w:tc>
           <w:tcPr>
@@ -4601,6 +4623,7 @@
                 <w:sz w:val="16"/>
                 <w:szCs w:val="16"/>
               </w:rPr>
+              <w:lastRenderedPageBreak/>
               <w:t>Material</w:t>
             </w:r>
             <w:r>
@@ -4780,7 +4803,6 @@
                 <w:sz w:val="16"/>
                 <w:szCs w:val="16"/>
               </w:rPr>
-              <w:lastRenderedPageBreak/>
               <w:t>Teacher Prep</w:t>
             </w:r>
           </w:p>
@@ -6791,6 +6813,7 @@
                 <w:sz w:val="16"/>
                 <w:szCs w:val="16"/>
               </w:rPr>
+              <w:lastRenderedPageBreak/>
               <w:t>Goals</w:t>
             </w:r>
           </w:p>
@@ -6960,7 +6983,6 @@
                 <w:sz w:val="16"/>
                 <w:szCs w:val="16"/>
               </w:rPr>
-              <w:lastRenderedPageBreak/>
               <w:t>Material</w:t>
             </w:r>
             <w:r>
@@ -8984,6 +9006,7 @@
                 <w:sz w:val="16"/>
                 <w:szCs w:val="16"/>
               </w:rPr>
+              <w:lastRenderedPageBreak/>
               <w:t>Activity</w:t>
             </w:r>
           </w:p>

</xml_diff>

<commit_message>
Final adjustments to the HLP.
</commit_message>
<xml_diff>
--- a/templates/docx_templates/horizontal_lesson_plan_master.docx
+++ b/templates/docx_templates/horizontal_lesson_plan_master.docx
@@ -5,7 +5,7 @@
     <w:tbl>
       <w:tblPr>
         <w:tblStyle w:val="TableGrid"/>
-        <w:tblpPr w:leftFromText="180" w:rightFromText="180" w:vertAnchor="text" w:horzAnchor="margin" w:tblpXSpec="right" w:tblpY="619"/>
+        <w:tblpPr w:leftFromText="180" w:rightFromText="180" w:vertAnchor="text" w:horzAnchor="margin" w:tblpXSpec="right" w:tblpY="420"/>
         <w:tblW w:w="0" w:type="auto"/>
         <w:tblBorders>
           <w:top w:val="none" w:sz="0" w:space="0" w:color="auto"/>
@@ -18,15 +18,15 @@
         <w:tblLook w:val="04A0" w:firstRow="1" w:lastRow="0" w:firstColumn="1" w:lastColumn="0" w:noHBand="0" w:noVBand="1"/>
       </w:tblPr>
       <w:tblGrid>
-        <w:gridCol w:w="3865"/>
-        <w:gridCol w:w="4950"/>
+        <w:gridCol w:w="4500"/>
+        <w:gridCol w:w="4680"/>
         <w:gridCol w:w="4230"/>
-        <w:gridCol w:w="3834"/>
+        <w:gridCol w:w="3469"/>
       </w:tblGrid>
       <w:tr>
         <w:tc>
           <w:tcPr>
-            <w:tcW w:w="3865" w:type="dxa"/>
+            <w:tcW w:w="4500" w:type="dxa"/>
           </w:tcPr>
           <w:p>
             <w:pPr>
@@ -59,22 +59,11 @@
               </w:rPr>
               <w:t>{{ school.name }}</w:t>
             </w:r>
-            <w:r>
-              <w:rPr>
-                <w:rFonts w:ascii="Segoe UI" w:eastAsia="Calibri" w:hAnsi="Segoe UI" w:cs="Segoe UI"/>
-                <w:b/>
-                <w:bCs/>
-                <w:sz w:val="24"/>
-                <w:szCs w:val="24"/>
-                <w:u w:val="single"/>
-              </w:rPr>
-              <w:t>___</w:t>
-            </w:r>
-          </w:p>
-        </w:tc>
-        <w:tc>
-          <w:tcPr>
-            <w:tcW w:w="4950" w:type="dxa"/>
+          </w:p>
+        </w:tc>
+        <w:tc>
+          <w:tcPr>
+            <w:tcW w:w="4680" w:type="dxa"/>
           </w:tcPr>
           <w:p>
             <w:pPr>
@@ -213,6 +202,29 @@
               </w:rPr>
               <w:t>{{ teacher.name }}</w:t>
             </w:r>
+          </w:p>
+        </w:tc>
+        <w:tc>
+          <w:tcPr>
+            <w:tcW w:w="3469" w:type="dxa"/>
+          </w:tcPr>
+          <w:p>
+            <w:pPr>
+              <w:jc w:val="right"/>
+              <w:rPr>
+                <w:rFonts w:ascii="Calibri" w:eastAsia="Calibri" w:hAnsi="Calibri" w:cs="Calibri"/>
+              </w:rPr>
+            </w:pPr>
+            <w:r>
+              <w:rPr>
+                <w:rFonts w:ascii="Segoe UI" w:eastAsia="Calibri" w:hAnsi="Segoe UI" w:cs="Segoe UI"/>
+                <w:b/>
+                <w:bCs/>
+                <w:sz w:val="24"/>
+                <w:szCs w:val="24"/>
+              </w:rPr>
+              <w:t xml:space="preserve">SCHOOL YEAR: </w:t>
+            </w:r>
             <w:r>
               <w:rPr>
                 <w:rFonts w:ascii="Segoe UI" w:eastAsia="Calibri" w:hAnsi="Segoe UI" w:cs="Segoe UI"/>
@@ -222,52 +234,7 @@
                 <w:szCs w:val="24"/>
                 <w:u w:val="single"/>
               </w:rPr>
-              <w:t>___</w:t>
-            </w:r>
-          </w:p>
-        </w:tc>
-        <w:tc>
-          <w:tcPr>
-            <w:tcW w:w="3834" w:type="dxa"/>
-          </w:tcPr>
-          <w:p>
-            <w:pPr>
-              <w:jc w:val="right"/>
-              <w:rPr>
-                <w:rFonts w:ascii="Calibri" w:eastAsia="Calibri" w:hAnsi="Calibri" w:cs="Calibri"/>
-              </w:rPr>
-            </w:pPr>
-            <w:r>
-              <w:rPr>
-                <w:rFonts w:ascii="Segoe UI" w:eastAsia="Calibri" w:hAnsi="Segoe UI" w:cs="Segoe UI"/>
-                <w:b/>
-                <w:bCs/>
-                <w:sz w:val="24"/>
-                <w:szCs w:val="24"/>
-              </w:rPr>
-              <w:t xml:space="preserve">SCHOOL YEAR: </w:t>
-            </w:r>
-            <w:r>
-              <w:rPr>
-                <w:rFonts w:ascii="Segoe UI" w:eastAsia="Calibri" w:hAnsi="Segoe UI" w:cs="Segoe UI"/>
-                <w:b/>
-                <w:bCs/>
-                <w:sz w:val="24"/>
-                <w:szCs w:val="24"/>
-                <w:u w:val="single"/>
-              </w:rPr>
               <w:t>{{ term }}</w:t>
-            </w:r>
-            <w:r>
-              <w:rPr>
-                <w:rFonts w:ascii="Segoe UI" w:eastAsia="Calibri" w:hAnsi="Segoe UI" w:cs="Segoe UI"/>
-                <w:b/>
-                <w:bCs/>
-                <w:sz w:val="24"/>
-                <w:szCs w:val="24"/>
-                <w:u w:val="single"/>
-              </w:rPr>
-              <w:t>___</w:t>
             </w:r>
           </w:p>
         </w:tc>
@@ -288,7 +255,7 @@
           <w:noProof/>
         </w:rPr>
         <w:drawing>
-          <wp:inline distT="0" distB="0" distL="0" distR="0" wp14:anchorId="7A4F1203" wp14:editId="1098626C">
+          <wp:inline distT="0" distB="0" distL="0" distR="0" wp14:anchorId="7A4F1203" wp14:editId="1D4892E8">
             <wp:extent cx="990600" cy="609600"/>
             <wp:effectExtent l="0" t="0" r="0" b="0"/>
             <wp:docPr id="1832731760" name="Picture 1832731760" descr="A logo with a fleur de lis&#10;&#10;AI-generated content may be incorrect."/>
@@ -2373,6 +2340,24 @@
               <w:t>{{ m3.s2.materials }}</w:t>
             </w:r>
           </w:p>
+          <w:p>
+            <w:pPr>
+              <w:rPr>
+                <w:rFonts w:ascii="Times New Roman" w:eastAsia="Times New Roman" w:hAnsi="Times New Roman" w:cs="Times New Roman"/>
+                <w:sz w:val="18"/>
+                <w:szCs w:val="18"/>
+              </w:rPr>
+            </w:pPr>
+          </w:p>
+          <w:p>
+            <w:pPr>
+              <w:rPr>
+                <w:rFonts w:ascii="Times New Roman" w:eastAsia="Times New Roman" w:hAnsi="Times New Roman" w:cs="Times New Roman"/>
+                <w:sz w:val="18"/>
+                <w:szCs w:val="18"/>
+              </w:rPr>
+            </w:pPr>
+          </w:p>
         </w:tc>
         <w:tc>
           <w:tcPr>
@@ -4531,6 +4516,33 @@
               </w:rPr>
               <w:t>{{ m3.s4.objectives }}</w:t>
             </w:r>
+          </w:p>
+          <w:p>
+            <w:pPr>
+              <w:rPr>
+                <w:rFonts w:ascii="Times New Roman" w:eastAsia="Times New Roman" w:hAnsi="Times New Roman" w:cs="Times New Roman"/>
+                <w:sz w:val="18"/>
+                <w:szCs w:val="18"/>
+              </w:rPr>
+            </w:pPr>
+          </w:p>
+          <w:p>
+            <w:pPr>
+              <w:rPr>
+                <w:rFonts w:ascii="Times New Roman" w:eastAsia="Times New Roman" w:hAnsi="Times New Roman" w:cs="Times New Roman"/>
+                <w:sz w:val="18"/>
+                <w:szCs w:val="18"/>
+              </w:rPr>
+            </w:pPr>
+          </w:p>
+          <w:p>
+            <w:pPr>
+              <w:rPr>
+                <w:rFonts w:ascii="Times New Roman" w:eastAsia="Times New Roman" w:hAnsi="Times New Roman" w:cs="Times New Roman"/>
+                <w:sz w:val="18"/>
+                <w:szCs w:val="18"/>
+              </w:rPr>
+            </w:pPr>
           </w:p>
         </w:tc>
         <w:tc>
@@ -9295,6 +9307,60 @@
       <w:pStyle w:val="Footer"/>
       <w:ind w:right="360"/>
     </w:pPr>
+    <w:r>
+      <w:rPr>
+        <w:noProof/>
+      </w:rPr>
+      <w:drawing>
+        <wp:anchor distT="0" distB="0" distL="0" distR="0" simplePos="0" relativeHeight="251659264" behindDoc="1" locked="0" layoutInCell="1" allowOverlap="1" wp14:anchorId="4892BD3B" wp14:editId="054A39EF">
+          <wp:simplePos x="0" y="0"/>
+          <wp:positionH relativeFrom="page">
+            <wp:posOffset>5924550</wp:posOffset>
+          </wp:positionH>
+          <wp:positionV relativeFrom="page">
+            <wp:posOffset>7405802</wp:posOffset>
+          </wp:positionV>
+          <wp:extent cx="950976" cy="283464"/>
+          <wp:effectExtent l="0" t="0" r="1905" b="0"/>
+          <wp:wrapNone/>
+          <wp:docPr id="2" name="Image 2" descr="A black and grey logo&#10;&#10;AI-generated content may be incorrect."/>
+          <wp:cNvGraphicFramePr>
+            <a:graphicFrameLocks xmlns:a="http://schemas.openxmlformats.org/drawingml/2006/main"/>
+          </wp:cNvGraphicFramePr>
+          <a:graphic xmlns:a="http://schemas.openxmlformats.org/drawingml/2006/main">
+            <a:graphicData uri="http://schemas.openxmlformats.org/drawingml/2006/picture">
+              <pic:pic xmlns:pic="http://schemas.openxmlformats.org/drawingml/2006/picture">
+                <pic:nvPicPr>
+                  <pic:cNvPr id="2" name="Image 2" descr="A black and grey logo&#10;&#10;AI-generated content may be incorrect."/>
+                  <pic:cNvPicPr/>
+                </pic:nvPicPr>
+                <pic:blipFill>
+                  <a:blip r:embed="rId1" cstate="print"/>
+                  <a:stretch>
+                    <a:fillRect/>
+                  </a:stretch>
+                </pic:blipFill>
+                <pic:spPr>
+                  <a:xfrm>
+                    <a:off x="0" y="0"/>
+                    <a:ext cx="950976" cy="283464"/>
+                  </a:xfrm>
+                  <a:prstGeom prst="rect">
+                    <a:avLst/>
+                  </a:prstGeom>
+                </pic:spPr>
+              </pic:pic>
+            </a:graphicData>
+          </a:graphic>
+          <wp14:sizeRelH relativeFrom="margin">
+            <wp14:pctWidth>0</wp14:pctWidth>
+          </wp14:sizeRelH>
+          <wp14:sizeRelV relativeFrom="margin">
+            <wp14:pctHeight>0</wp14:pctHeight>
+          </wp14:sizeRelV>
+        </wp:anchor>
+      </w:drawing>
+    </w:r>
   </w:p>
 </w:ftr>
 </file>

</xml_diff>